<commit_message>
Ajustes del reporte y presentacion
</commit_message>
<xml_diff>
--- a/docs/reporte.docx
+++ b/docs/reporte.docx
@@ -1250,15 +1250,7 @@
         <w:t>Ángeles</w:t>
       </w:r>
       <w:r>
-        <w:t xml:space="preserve">, generalmente también aumentan en New York, y viceversa. Esto sugiere que ambos puertos responden a dinámicas similares del comercio internacional, probablemente influenciadas por factores macroeconómicos globales como el crecimiento económico de </w:t>
-      </w:r>
-      <w:proofErr w:type="gramStart"/>
-      <w:r>
-        <w:t>EE.UU.</w:t>
-      </w:r>
-      <w:proofErr w:type="gramEnd"/>
-      <w:r>
-        <w:t>, la demanda de bienes de consumo, y la relación comercial con Asia.</w:t>
+        <w:t>, generalmente también aumentan en New York, y viceversa. Esto sugiere que ambos puertos responden a dinámicas similares del comercio internacional, probablemente influenciadas por factores macroeconómicos globales como el crecimiento económico de EE.UU., la demanda de bienes de consumo, y la relación comercial con Asia.</w:t>
       </w:r>
     </w:p>
     <w:p>
@@ -2042,6 +2034,9 @@
     </w:p>
     <w:p>
       <w:r>
+        <w:rPr>
+          <w:noProof/>
+        </w:rPr>
         <w:drawing>
           <wp:inline distT="0" distB="0" distL="0" distR="0" wp14:anchorId="7D2F0362" wp14:editId="472689B7">
             <wp:extent cx="5612130" cy="3361690"/>
@@ -2311,10 +2306,7 @@
     <w:p>
       <w:r>
         <w:lastRenderedPageBreak/>
-        <w:t>Análisis de regresión con tendencia exponencial</w:t>
-      </w:r>
-      <w:r>
-        <w:t xml:space="preserve"> para el puerto </w:t>
+        <w:t xml:space="preserve">Análisis de regresión con tendencia exponencial para el puerto </w:t>
       </w:r>
       <w:r>
         <w:t>Savannah, GA</w:t>
@@ -2322,6 +2314,9 @@
     </w:p>
     <w:p>
       <w:r>
+        <w:rPr>
+          <w:noProof/>
+        </w:rPr>
         <w:drawing>
           <wp:inline distT="0" distB="0" distL="0" distR="0" wp14:anchorId="156F8472" wp14:editId="61097076">
             <wp:extent cx="5612130" cy="3359785"/>
@@ -2635,6 +2630,574 @@
       </w:tr>
     </w:tbl>
     <w:p/>
+    <w:p>
+      <w:r>
+        <w:br w:type="page"/>
+      </w:r>
+    </w:p>
+    <w:p>
+      <w:r>
+        <w:lastRenderedPageBreak/>
+        <w:t>Análisis de Series de tiempo (M</w:t>
+      </w:r>
+      <w:r>
+        <w:t>odelo de suavizamiento exponencial</w:t>
+      </w:r>
+      <w:r>
+        <w:t xml:space="preserve"> – Modelo Holt-</w:t>
+      </w:r>
+      <w:proofErr w:type="spellStart"/>
+      <w:r>
+        <w:t>Winters</w:t>
+      </w:r>
+      <w:proofErr w:type="spellEnd"/>
+      <w:r>
+        <w:t xml:space="preserve">) puerto </w:t>
+      </w:r>
+      <w:r>
+        <w:t>Miami, FL</w:t>
+      </w:r>
+    </w:p>
+    <w:p>
+      <w:r>
+        <w:drawing>
+          <wp:inline distT="0" distB="0" distL="0" distR="0" wp14:anchorId="011826ED" wp14:editId="60AF904C">
+            <wp:extent cx="5612130" cy="3362960"/>
+            <wp:effectExtent l="0" t="0" r="7620" b="8890"/>
+            <wp:docPr id="1368843912" name="Picture 1" descr="A graph with blue and orange lines&#10;&#10;AI-generated content may be incorrect."/>
+            <wp:cNvGraphicFramePr>
+              <a:graphicFrameLocks xmlns:a="http://schemas.openxmlformats.org/drawingml/2006/main" noChangeAspect="1"/>
+            </wp:cNvGraphicFramePr>
+            <a:graphic xmlns:a="http://schemas.openxmlformats.org/drawingml/2006/main">
+              <a:graphicData uri="http://schemas.openxmlformats.org/drawingml/2006/picture">
+                <pic:pic xmlns:pic="http://schemas.openxmlformats.org/drawingml/2006/picture">
+                  <pic:nvPicPr>
+                    <pic:cNvPr id="1368843912" name="Picture 1" descr="A graph with blue and orange lines&#10;&#10;AI-generated content may be incorrect."/>
+                    <pic:cNvPicPr/>
+                  </pic:nvPicPr>
+                  <pic:blipFill>
+                    <a:blip r:embed="rId20"/>
+                    <a:stretch>
+                      <a:fillRect/>
+                    </a:stretch>
+                  </pic:blipFill>
+                  <pic:spPr>
+                    <a:xfrm>
+                      <a:off x="0" y="0"/>
+                      <a:ext cx="5612130" cy="3362960"/>
+                    </a:xfrm>
+                    <a:prstGeom prst="rect">
+                      <a:avLst/>
+                    </a:prstGeom>
+                  </pic:spPr>
+                </pic:pic>
+              </a:graphicData>
+            </a:graphic>
+          </wp:inline>
+        </w:drawing>
+      </w:r>
+    </w:p>
+    <w:p/>
+    <w:p>
+      <w:r>
+        <w:t>Dando como resultado la siguiente tabla de predicciones.</w:t>
+      </w:r>
+    </w:p>
+    <w:tbl>
+      <w:tblPr>
+        <w:tblStyle w:val="GridTable7Colorful-Accent1"/>
+        <w:tblW w:w="0" w:type="auto"/>
+        <w:tblLook w:val="04A0" w:firstRow="1" w:lastRow="0" w:firstColumn="1" w:lastColumn="0" w:noHBand="0" w:noVBand="1"/>
+      </w:tblPr>
+      <w:tblGrid>
+        <w:gridCol w:w="1129"/>
+        <w:gridCol w:w="3071"/>
+      </w:tblGrid>
+      <w:tr>
+        <w:trPr>
+          <w:cnfStyle w:val="100000000000" w:firstRow="1" w:lastRow="0" w:firstColumn="0" w:lastColumn="0" w:oddVBand="0" w:evenVBand="0" w:oddHBand="0" w:evenHBand="0" w:firstRowFirstColumn="0" w:firstRowLastColumn="0" w:lastRowFirstColumn="0" w:lastRowLastColumn="0"/>
+          <w:trHeight w:val="288"/>
+        </w:trPr>
+        <w:tc>
+          <w:tcPr>
+            <w:cnfStyle w:val="001000000100" w:firstRow="0" w:lastRow="0" w:firstColumn="1" w:lastColumn="0" w:oddVBand="0" w:evenVBand="0" w:oddHBand="0" w:evenHBand="0" w:firstRowFirstColumn="1" w:firstRowLastColumn="0" w:lastRowFirstColumn="0" w:lastRowLastColumn="0"/>
+            <w:tcW w:w="1129" w:type="dxa"/>
+          </w:tcPr>
+          <w:p>
+            <w:r>
+              <w:rPr>
+                <w:b w:val="0"/>
+                <w:bCs w:val="0"/>
+                <w:sz w:val="22"/>
+                <w:szCs w:val="22"/>
+              </w:rPr>
+              <w:t>Año</w:t>
+            </w:r>
+          </w:p>
+        </w:tc>
+        <w:tc>
+          <w:tcPr>
+            <w:tcW w:w="3071" w:type="dxa"/>
+          </w:tcPr>
+          <w:p>
+            <w:pPr>
+              <w:cnfStyle w:val="100000000000" w:firstRow="1" w:lastRow="0" w:firstColumn="0" w:lastColumn="0" w:oddVBand="0" w:evenVBand="0" w:oddHBand="0" w:evenHBand="0" w:firstRowFirstColumn="0" w:firstRowLastColumn="0" w:lastRowFirstColumn="0" w:lastRowLastColumn="0"/>
+              <w:rPr>
+                <w:b w:val="0"/>
+                <w:bCs w:val="0"/>
+              </w:rPr>
+            </w:pPr>
+            <w:r>
+              <w:rPr>
+                <w:b w:val="0"/>
+                <w:bCs w:val="0"/>
+                <w:sz w:val="20"/>
+                <w:szCs w:val="20"/>
+              </w:rPr>
+              <w:t>Importaciones estimadas (toneladas métricas)</w:t>
+            </w:r>
+          </w:p>
+        </w:tc>
+      </w:tr>
+      <w:tr>
+        <w:trPr>
+          <w:cnfStyle w:val="000000100000" w:firstRow="0" w:lastRow="0" w:firstColumn="0" w:lastColumn="0" w:oddVBand="0" w:evenVBand="0" w:oddHBand="1" w:evenHBand="0" w:firstRowFirstColumn="0" w:firstRowLastColumn="0" w:lastRowFirstColumn="0" w:lastRowLastColumn="0"/>
+          <w:trHeight w:val="318"/>
+        </w:trPr>
+        <w:tc>
+          <w:tcPr>
+            <w:cnfStyle w:val="001000000000" w:firstRow="0" w:lastRow="0" w:firstColumn="1" w:lastColumn="0" w:oddVBand="0" w:evenVBand="0" w:oddHBand="0" w:evenHBand="0" w:firstRowFirstColumn="0" w:firstRowLastColumn="0" w:lastRowFirstColumn="0" w:lastRowLastColumn="0"/>
+            <w:tcW w:w="1129" w:type="dxa"/>
+          </w:tcPr>
+          <w:p>
+            <w:r>
+              <w:t>2018</w:t>
+            </w:r>
+          </w:p>
+        </w:tc>
+        <w:tc>
+          <w:tcPr>
+            <w:tcW w:w="3071" w:type="dxa"/>
+          </w:tcPr>
+          <w:p>
+            <w:pPr>
+              <w:cnfStyle w:val="000000100000" w:firstRow="0" w:lastRow="0" w:firstColumn="0" w:lastColumn="0" w:oddVBand="0" w:evenVBand="0" w:oddHBand="1" w:evenHBand="0" w:firstRowFirstColumn="0" w:firstRowLastColumn="0" w:lastRowFirstColumn="0" w:lastRowLastColumn="0"/>
+            </w:pPr>
+            <w:r>
+              <w:t>3</w:t>
+            </w:r>
+            <w:r>
+              <w:t>,</w:t>
+            </w:r>
+            <w:r>
+              <w:t>871</w:t>
+            </w:r>
+            <w:r>
+              <w:t>,</w:t>
+            </w:r>
+            <w:r>
+              <w:t>869</w:t>
+            </w:r>
+          </w:p>
+        </w:tc>
+      </w:tr>
+      <w:tr>
+        <w:trPr>
+          <w:trHeight w:val="311"/>
+        </w:trPr>
+        <w:tc>
+          <w:tcPr>
+            <w:cnfStyle w:val="001000000000" w:firstRow="0" w:lastRow="0" w:firstColumn="1" w:lastColumn="0" w:oddVBand="0" w:evenVBand="0" w:oddHBand="0" w:evenHBand="0" w:firstRowFirstColumn="0" w:firstRowLastColumn="0" w:lastRowFirstColumn="0" w:lastRowLastColumn="0"/>
+            <w:tcW w:w="1129" w:type="dxa"/>
+          </w:tcPr>
+          <w:p>
+            <w:r>
+              <w:t>2019</w:t>
+            </w:r>
+          </w:p>
+        </w:tc>
+        <w:tc>
+          <w:tcPr>
+            <w:tcW w:w="3071" w:type="dxa"/>
+          </w:tcPr>
+          <w:p>
+            <w:pPr>
+              <w:cnfStyle w:val="000000000000" w:firstRow="0" w:lastRow="0" w:firstColumn="0" w:lastColumn="0" w:oddVBand="0" w:evenVBand="0" w:oddHBand="0" w:evenHBand="0" w:firstRowFirstColumn="0" w:firstRowLastColumn="0" w:lastRowFirstColumn="0" w:lastRowLastColumn="0"/>
+            </w:pPr>
+            <w:r>
+              <w:t>4</w:t>
+            </w:r>
+            <w:r>
+              <w:t>,</w:t>
+            </w:r>
+            <w:r>
+              <w:t>044</w:t>
+            </w:r>
+            <w:r>
+              <w:t>,</w:t>
+            </w:r>
+            <w:r>
+              <w:t>527</w:t>
+            </w:r>
+          </w:p>
+        </w:tc>
+      </w:tr>
+      <w:tr>
+        <w:trPr>
+          <w:cnfStyle w:val="000000100000" w:firstRow="0" w:lastRow="0" w:firstColumn="0" w:lastColumn="0" w:oddVBand="0" w:evenVBand="0" w:oddHBand="1" w:evenHBand="0" w:firstRowFirstColumn="0" w:firstRowLastColumn="0" w:lastRowFirstColumn="0" w:lastRowLastColumn="0"/>
+          <w:trHeight w:val="318"/>
+        </w:trPr>
+        <w:tc>
+          <w:tcPr>
+            <w:cnfStyle w:val="001000000000" w:firstRow="0" w:lastRow="0" w:firstColumn="1" w:lastColumn="0" w:oddVBand="0" w:evenVBand="0" w:oddHBand="0" w:evenHBand="0" w:firstRowFirstColumn="0" w:firstRowLastColumn="0" w:lastRowFirstColumn="0" w:lastRowLastColumn="0"/>
+            <w:tcW w:w="1129" w:type="dxa"/>
+          </w:tcPr>
+          <w:p>
+            <w:r>
+              <w:t>2020</w:t>
+            </w:r>
+          </w:p>
+        </w:tc>
+        <w:tc>
+          <w:tcPr>
+            <w:tcW w:w="3071" w:type="dxa"/>
+          </w:tcPr>
+          <w:p>
+            <w:pPr>
+              <w:cnfStyle w:val="000000100000" w:firstRow="0" w:lastRow="0" w:firstColumn="0" w:lastColumn="0" w:oddVBand="0" w:evenVBand="0" w:oddHBand="1" w:evenHBand="0" w:firstRowFirstColumn="0" w:firstRowLastColumn="0" w:lastRowFirstColumn="0" w:lastRowLastColumn="0"/>
+            </w:pPr>
+            <w:r>
+              <w:t>4</w:t>
+            </w:r>
+            <w:r>
+              <w:t>,</w:t>
+            </w:r>
+            <w:r>
+              <w:t>133</w:t>
+            </w:r>
+            <w:r>
+              <w:t>,</w:t>
+            </w:r>
+            <w:r>
+              <w:t>424</w:t>
+            </w:r>
+          </w:p>
+        </w:tc>
+      </w:tr>
+      <w:tr>
+        <w:trPr>
+          <w:trHeight w:val="311"/>
+        </w:trPr>
+        <w:tc>
+          <w:tcPr>
+            <w:cnfStyle w:val="001000000000" w:firstRow="0" w:lastRow="0" w:firstColumn="1" w:lastColumn="0" w:oddVBand="0" w:evenVBand="0" w:oddHBand="0" w:evenHBand="0" w:firstRowFirstColumn="0" w:firstRowLastColumn="0" w:lastRowFirstColumn="0" w:lastRowLastColumn="0"/>
+            <w:tcW w:w="1129" w:type="dxa"/>
+          </w:tcPr>
+          <w:p>
+            <w:r>
+              <w:t>2021</w:t>
+            </w:r>
+          </w:p>
+        </w:tc>
+        <w:tc>
+          <w:tcPr>
+            <w:tcW w:w="3071" w:type="dxa"/>
+          </w:tcPr>
+          <w:p>
+            <w:pPr>
+              <w:cnfStyle w:val="000000000000" w:firstRow="0" w:lastRow="0" w:firstColumn="0" w:lastColumn="0" w:oddVBand="0" w:evenVBand="0" w:oddHBand="0" w:evenHBand="0" w:firstRowFirstColumn="0" w:firstRowLastColumn="0" w:lastRowFirstColumn="0" w:lastRowLastColumn="0"/>
+            </w:pPr>
+            <w:r>
+              <w:t>4</w:t>
+            </w:r>
+            <w:r>
+              <w:t>,</w:t>
+            </w:r>
+            <w:r>
+              <w:t>367</w:t>
+            </w:r>
+            <w:r>
+              <w:t>,</w:t>
+            </w:r>
+            <w:r>
+              <w:t>544</w:t>
+            </w:r>
+          </w:p>
+        </w:tc>
+      </w:tr>
+      <w:tr>
+        <w:trPr>
+          <w:cnfStyle w:val="000000100000" w:firstRow="0" w:lastRow="0" w:firstColumn="0" w:lastColumn="0" w:oddVBand="0" w:evenVBand="0" w:oddHBand="1" w:evenHBand="0" w:firstRowFirstColumn="0" w:firstRowLastColumn="0" w:lastRowFirstColumn="0" w:lastRowLastColumn="0"/>
+          <w:trHeight w:val="318"/>
+        </w:trPr>
+        <w:tc>
+          <w:tcPr>
+            <w:cnfStyle w:val="001000000000" w:firstRow="0" w:lastRow="0" w:firstColumn="1" w:lastColumn="0" w:oddVBand="0" w:evenVBand="0" w:oddHBand="0" w:evenHBand="0" w:firstRowFirstColumn="0" w:firstRowLastColumn="0" w:lastRowFirstColumn="0" w:lastRowLastColumn="0"/>
+            <w:tcW w:w="1129" w:type="dxa"/>
+          </w:tcPr>
+          <w:p>
+            <w:r>
+              <w:t>2022</w:t>
+            </w:r>
+          </w:p>
+        </w:tc>
+        <w:tc>
+          <w:tcPr>
+            <w:tcW w:w="3071" w:type="dxa"/>
+          </w:tcPr>
+          <w:p>
+            <w:pPr>
+              <w:cnfStyle w:val="000000100000" w:firstRow="0" w:lastRow="0" w:firstColumn="0" w:lastColumn="0" w:oddVBand="0" w:evenVBand="0" w:oddHBand="1" w:evenHBand="0" w:firstRowFirstColumn="0" w:firstRowLastColumn="0" w:lastRowFirstColumn="0" w:lastRowLastColumn="0"/>
+            </w:pPr>
+            <w:r>
+              <w:t>4</w:t>
+            </w:r>
+            <w:r>
+              <w:t>,</w:t>
+            </w:r>
+            <w:r>
+              <w:t>131</w:t>
+            </w:r>
+            <w:r>
+              <w:t>,</w:t>
+            </w:r>
+            <w:r>
+              <w:t>198</w:t>
+            </w:r>
+          </w:p>
+        </w:tc>
+      </w:tr>
+    </w:tbl>
+    <w:p/>
+    <w:p>
+      <w:r>
+        <w:br w:type="page"/>
+      </w:r>
+    </w:p>
+    <w:p>
+      <w:r>
+        <w:rPr>
+          <w:b/>
+          <w:bCs/>
+        </w:rPr>
+        <w:lastRenderedPageBreak/>
+        <w:t>Conclusiones</w:t>
+      </w:r>
+    </w:p>
+    <w:p>
+      <w:r>
+        <w:t>El análisis de las importaciones en los principales puertos de la costa este de Estados Unidos entre 2000 y 2017 revela una tendencia de crecimiento sostenido, reflejo del fortalecimiento del comercio internacional y del rol estratégico que estos puertos desempeñan en la logística global. Puertos como New York, NY, Savannah, GA y Charleston, SC han mostrado aumentos significativos en el volumen de mercancías recibidas, impulsados por la creciente demanda de bienes de consumo, maquinaria y productos electrónicos, en su mayoría provenientes de Asia. Este crecimiento constante en las importaciones no solo evidencia el dinamismo económico de la región, sino que también plantea desafíos en términos de infraestructura, eficiencia operativa y planificación portuaria. En este contexto, contar con herramientas de análisis y proyección, como las utilizadas en este estudio, resulta esencial para anticipar tendencias, optimizar recursos y mantener la competitividad frente al creciente volumen de comercio marítimo.</w:t>
+      </w:r>
+    </w:p>
+    <w:p/>
+    <w:p>
+      <w:r>
+        <w:br w:type="page"/>
+      </w:r>
+    </w:p>
+    <w:p>
+      <w:r>
+        <w:rPr>
+          <w:b/>
+          <w:bCs/>
+        </w:rPr>
+        <w:lastRenderedPageBreak/>
+        <w:t>Recomendaciones</w:t>
+      </w:r>
+    </w:p>
+    <w:p>
+      <w:r>
+        <w:t xml:space="preserve">Mis recomendaciones a los puertos estudiados sería prepararse para aun aumento en las importaciones para los próximos 4 años y en el caso de New York y </w:t>
+      </w:r>
+      <w:proofErr w:type="spellStart"/>
+      <w:r>
+        <w:t>Saavana</w:t>
+      </w:r>
+      <w:proofErr w:type="spellEnd"/>
+      <w:r>
+        <w:t xml:space="preserve"> preparase aun más ya que se estima un crecimiento exponencial en las importaciones.</w:t>
+      </w:r>
+    </w:p>
+    <w:p/>
+    <w:p>
+      <w:r>
+        <w:br w:type="page"/>
+      </w:r>
+    </w:p>
+    <w:p>
+      <w:r>
+        <w:rPr>
+          <w:b/>
+          <w:bCs/>
+        </w:rPr>
+        <w:lastRenderedPageBreak/>
+        <w:t>Bibliografía</w:t>
+      </w:r>
+    </w:p>
+    <w:p>
+      <w:pPr>
+        <w:pStyle w:val="ListParagraph"/>
+        <w:numPr>
+          <w:ilvl w:val="0"/>
+          <w:numId w:val="2"/>
+        </w:numPr>
+      </w:pPr>
+      <w:hyperlink r:id="rId21" w:history="1">
+        <w:r>
+          <w:rPr>
+            <w:rStyle w:val="Hyperlink"/>
+          </w:rPr>
+          <w:t>https://www.kaggle.com/datasets/ryanjt/usacontainerports20002017</w:t>
+        </w:r>
+      </w:hyperlink>
+    </w:p>
+    <w:p>
+      <w:pPr>
+        <w:pStyle w:val="ListParagraph"/>
+        <w:numPr>
+          <w:ilvl w:val="0"/>
+          <w:numId w:val="2"/>
+        </w:numPr>
+      </w:pPr>
+      <w:hyperlink r:id="rId22" w:history="1">
+        <w:r>
+          <w:rPr>
+            <w:rStyle w:val="Hyperlink"/>
+          </w:rPr>
+          <w:t>https://www.kaggle.com/datasets/anindyos/shipping-volume-data</w:t>
+        </w:r>
+      </w:hyperlink>
+    </w:p>
+    <w:p>
+      <w:pPr>
+        <w:pStyle w:val="ListParagraph"/>
+        <w:numPr>
+          <w:ilvl w:val="0"/>
+          <w:numId w:val="2"/>
+        </w:numPr>
+      </w:pPr>
+      <w:hyperlink r:id="rId23" w:history="1">
+        <w:r>
+          <w:rPr>
+            <w:rStyle w:val="Hyperlink"/>
+          </w:rPr>
+          <w:t>https://pancanal.com/estadisticas/</w:t>
+        </w:r>
+      </w:hyperlink>
+    </w:p>
+    <w:p>
+      <w:pPr>
+        <w:pStyle w:val="ListParagraph"/>
+        <w:numPr>
+          <w:ilvl w:val="0"/>
+          <w:numId w:val="2"/>
+        </w:numPr>
+      </w:pPr>
+      <w:hyperlink r:id="rId24" w:history="1">
+        <w:r>
+          <w:rPr>
+            <w:rStyle w:val="Hyperlink"/>
+          </w:rPr>
+          <w:t>https://www.icontainers.com/es/2019/02/12/los-mayores-puertos-de-la-costa-este-de-estados-unidos</w:t>
+        </w:r>
+      </w:hyperlink>
+    </w:p>
+    <w:p>
+      <w:pPr>
+        <w:pStyle w:val="ListParagraph"/>
+        <w:numPr>
+          <w:ilvl w:val="0"/>
+          <w:numId w:val="2"/>
+        </w:numPr>
+      </w:pPr>
+      <w:hyperlink r:id="rId25" w:history="1">
+        <w:r>
+          <w:rPr>
+            <w:rStyle w:val="Hyperlink"/>
+          </w:rPr>
+          <w:t>https://www.vecteezy.com/</w:t>
+        </w:r>
+      </w:hyperlink>
+    </w:p>
+    <w:p>
+      <w:pPr>
+        <w:pStyle w:val="ListParagraph"/>
+        <w:numPr>
+          <w:ilvl w:val="0"/>
+          <w:numId w:val="2"/>
+        </w:numPr>
+      </w:pPr>
+      <w:hyperlink r:id="rId26" w:history="1">
+        <w:r>
+          <w:rPr>
+            <w:rStyle w:val="Hyperlink"/>
+          </w:rPr>
+          <w:t>https://www.maritime.dot.gov/data-reports/us-flag-fleet-current</w:t>
+        </w:r>
+      </w:hyperlink>
+    </w:p>
+    <w:p>
+      <w:pPr>
+        <w:pStyle w:val="ListParagraph"/>
+      </w:pPr>
+    </w:p>
+    <w:p>
+      <w:r>
+        <w:br w:type="page"/>
+      </w:r>
+    </w:p>
+    <w:p>
+      <w:r>
+        <w:rPr>
+          <w:b/>
+          <w:bCs/>
+        </w:rPr>
+        <w:lastRenderedPageBreak/>
+        <w:t>Anexo</w:t>
+      </w:r>
+    </w:p>
+    <w:p>
+      <w:r>
+        <w:t xml:space="preserve">Link del repositorio en </w:t>
+      </w:r>
+      <w:r>
+        <w:t>GitHub, utilizar e</w:t>
+      </w:r>
+      <w:r>
+        <w:t xml:space="preserve">l Branch </w:t>
+      </w:r>
+      <w:proofErr w:type="spellStart"/>
+      <w:r>
+        <w:t>develop</w:t>
+      </w:r>
+      <w:proofErr w:type="spellEnd"/>
+      <w:r>
+        <w:t>.</w:t>
+      </w:r>
+    </w:p>
+    <w:p>
+      <w:pPr>
+        <w:rPr>
+          <w:lang w:val="en-US"/>
+        </w:rPr>
+      </w:pPr>
+      <w:hyperlink r:id="rId27" w:history="1">
+        <w:r>
+          <w:rPr>
+            <w:rStyle w:val="Hyperlink"/>
+            <w:lang w:val="en-US"/>
+          </w:rPr>
+          <w:t>https://github.com/isaacmedina/usa-container-ports-timeline-series.git</w:t>
+        </w:r>
+      </w:hyperlink>
+    </w:p>
+    <w:p>
+      <w:pPr>
+        <w:rPr>
+          <w:lang w:val="en-US"/>
+        </w:rPr>
+      </w:pPr>
+    </w:p>
     <w:sectPr>
       <w:pgSz w:w="12240" w:h="15840"/>
       <w:pgMar w:top="1417" w:right="1701" w:bottom="1417" w:left="1701" w:header="708" w:footer="708" w:gutter="0"/>
@@ -2648,9 +3211,9 @@
 <file path=word/numbering.xml><?xml version="1.0" encoding="utf-8"?>
 <w:numbering xmlns:wpc="http://schemas.microsoft.com/office/word/2010/wordprocessingCanvas" xmlns:cx="http://schemas.microsoft.com/office/drawing/2014/chartex" xmlns:cx1="http://schemas.microsoft.com/office/drawing/2015/9/8/chartex" xmlns:cx2="http://schemas.microsoft.com/office/drawing/2015/10/21/chartex" xmlns:cx3="http://schemas.microsoft.com/office/drawing/2016/5/9/chartex" xmlns:cx4="http://schemas.microsoft.com/office/drawing/2016/5/10/chartex" xmlns:cx5="http://schemas.microsoft.com/office/drawing/2016/5/11/chartex" xmlns:cx6="http://schemas.microsoft.com/office/drawing/2016/5/12/chartex" xmlns:cx7="http://schemas.microsoft.com/office/drawing/2016/5/13/chartex" xmlns:cx8="http://schemas.microsoft.com/office/drawing/2016/5/14/chartex" xmlns:mc="http://schemas.openxmlformats.org/markup-compatibility/2006" xmlns:aink="http://schemas.microsoft.com/office/drawing/2016/ink" xmlns:am3d="http://schemas.microsoft.com/office/drawing/2017/model3d" xmlns:o="urn:schemas-microsoft-com:office:office" xmlns:oel="http://schemas.microsoft.com/office/2019/extlst" xmlns:r="http://schemas.openxmlformats.org/officeDocument/2006/relationships" xmlns:m="http://schemas.openxmlformats.org/officeDocument/2006/math" xmlns:v="urn:schemas-microsoft-com:vml" xmlns:wp14="http://schemas.microsoft.com/office/word/2010/wordprocessingDrawing" xmlns:wp="http://schemas.openxmlformats.org/drawingml/2006/wordprocessingDrawing" xmlns:w10="urn:schemas-microsoft-com:office:word" xmlns:w="http://schemas.openxmlformats.org/wordprocessingml/2006/main" xmlns:w14="http://schemas.microsoft.com/office/word/2010/wordml" xmlns:w15="http://schemas.microsoft.com/office/word/2012/wordml" xmlns:w16cex="http://schemas.microsoft.com/office/word/2018/wordml/cex" xmlns:w16cid="http://schemas.microsoft.com/office/word/2016/wordml/cid" xmlns:w16="http://schemas.microsoft.com/office/word/2018/wordml" xmlns:w16du="http://schemas.microsoft.com/office/word/2023/wordml/word16du" xmlns:w16sdtdh="http://schemas.microsoft.com/office/word/2020/wordml/sdtdatahash" xmlns:w16sdtfl="http://schemas.microsoft.com/office/word/2024/wordml/sdtformatlock" xmlns:w16se="http://schemas.microsoft.com/office/word/2015/wordml/symex" xmlns:wpg="http://schemas.microsoft.com/office/word/2010/wordprocessingGroup" xmlns:wpi="http://schemas.microsoft.com/office/word/2010/wordprocessingInk" xmlns:wne="http://schemas.microsoft.com/office/word/2006/wordml" xmlns:wps="http://schemas.microsoft.com/office/word/2010/wordprocessingShape" mc:Ignorable="w14 w15 w16se w16cid w16 w16cex w16sdtdh w16sdtfl w16du wp14">
   <w:abstractNum w:abstractNumId="0" w15:restartNumberingAfterBreak="0">
-    <w:nsid w:val="53C278DA"/>
+    <w:nsid w:val="1BD2728F"/>
     <w:multiLevelType w:val="hybridMultilevel"/>
-    <w:tmpl w:val="3258B126"/>
+    <w:tmpl w:val="55A6458E"/>
     <w:lvl w:ilvl="0" w:tplc="180A0001">
       <w:start w:val="1"/>
       <w:numFmt w:val="bullet"/>
@@ -2760,7 +3323,123 @@
       </w:rPr>
     </w:lvl>
   </w:abstractNum>
+  <w:abstractNum w:abstractNumId="1" w15:restartNumberingAfterBreak="0">
+    <w:nsid w:val="53C278DA"/>
+    <w:multiLevelType w:val="hybridMultilevel"/>
+    <w:tmpl w:val="3258B126"/>
+    <w:lvl w:ilvl="0" w:tplc="180A0001">
+      <w:start w:val="1"/>
+      <w:numFmt w:val="bullet"/>
+      <w:lvlText w:val=""/>
+      <w:lvlJc w:val="left"/>
+      <w:pPr>
+        <w:ind w:left="720" w:hanging="360"/>
+      </w:pPr>
+      <w:rPr>
+        <w:rFonts w:ascii="Symbol" w:hAnsi="Symbol" w:hint="default"/>
+      </w:rPr>
+    </w:lvl>
+    <w:lvl w:ilvl="1" w:tplc="180A0003" w:tentative="1">
+      <w:start w:val="1"/>
+      <w:numFmt w:val="bullet"/>
+      <w:lvlText w:val="o"/>
+      <w:lvlJc w:val="left"/>
+      <w:pPr>
+        <w:ind w:left="1440" w:hanging="360"/>
+      </w:pPr>
+      <w:rPr>
+        <w:rFonts w:ascii="Courier New" w:hAnsi="Courier New" w:cs="Courier New" w:hint="default"/>
+      </w:rPr>
+    </w:lvl>
+    <w:lvl w:ilvl="2" w:tplc="180A0005" w:tentative="1">
+      <w:start w:val="1"/>
+      <w:numFmt w:val="bullet"/>
+      <w:lvlText w:val=""/>
+      <w:lvlJc w:val="left"/>
+      <w:pPr>
+        <w:ind w:left="2160" w:hanging="360"/>
+      </w:pPr>
+      <w:rPr>
+        <w:rFonts w:ascii="Wingdings" w:hAnsi="Wingdings" w:hint="default"/>
+      </w:rPr>
+    </w:lvl>
+    <w:lvl w:ilvl="3" w:tplc="180A0001" w:tentative="1">
+      <w:start w:val="1"/>
+      <w:numFmt w:val="bullet"/>
+      <w:lvlText w:val=""/>
+      <w:lvlJc w:val="left"/>
+      <w:pPr>
+        <w:ind w:left="2880" w:hanging="360"/>
+      </w:pPr>
+      <w:rPr>
+        <w:rFonts w:ascii="Symbol" w:hAnsi="Symbol" w:hint="default"/>
+      </w:rPr>
+    </w:lvl>
+    <w:lvl w:ilvl="4" w:tplc="180A0003" w:tentative="1">
+      <w:start w:val="1"/>
+      <w:numFmt w:val="bullet"/>
+      <w:lvlText w:val="o"/>
+      <w:lvlJc w:val="left"/>
+      <w:pPr>
+        <w:ind w:left="3600" w:hanging="360"/>
+      </w:pPr>
+      <w:rPr>
+        <w:rFonts w:ascii="Courier New" w:hAnsi="Courier New" w:cs="Courier New" w:hint="default"/>
+      </w:rPr>
+    </w:lvl>
+    <w:lvl w:ilvl="5" w:tplc="180A0005" w:tentative="1">
+      <w:start w:val="1"/>
+      <w:numFmt w:val="bullet"/>
+      <w:lvlText w:val=""/>
+      <w:lvlJc w:val="left"/>
+      <w:pPr>
+        <w:ind w:left="4320" w:hanging="360"/>
+      </w:pPr>
+      <w:rPr>
+        <w:rFonts w:ascii="Wingdings" w:hAnsi="Wingdings" w:hint="default"/>
+      </w:rPr>
+    </w:lvl>
+    <w:lvl w:ilvl="6" w:tplc="180A0001" w:tentative="1">
+      <w:start w:val="1"/>
+      <w:numFmt w:val="bullet"/>
+      <w:lvlText w:val=""/>
+      <w:lvlJc w:val="left"/>
+      <w:pPr>
+        <w:ind w:left="5040" w:hanging="360"/>
+      </w:pPr>
+      <w:rPr>
+        <w:rFonts w:ascii="Symbol" w:hAnsi="Symbol" w:hint="default"/>
+      </w:rPr>
+    </w:lvl>
+    <w:lvl w:ilvl="7" w:tplc="180A0003" w:tentative="1">
+      <w:start w:val="1"/>
+      <w:numFmt w:val="bullet"/>
+      <w:lvlText w:val="o"/>
+      <w:lvlJc w:val="left"/>
+      <w:pPr>
+        <w:ind w:left="5760" w:hanging="360"/>
+      </w:pPr>
+      <w:rPr>
+        <w:rFonts w:ascii="Courier New" w:hAnsi="Courier New" w:cs="Courier New" w:hint="default"/>
+      </w:rPr>
+    </w:lvl>
+    <w:lvl w:ilvl="8" w:tplc="180A0005" w:tentative="1">
+      <w:start w:val="1"/>
+      <w:numFmt w:val="bullet"/>
+      <w:lvlText w:val=""/>
+      <w:lvlJc w:val="left"/>
+      <w:pPr>
+        <w:ind w:left="6480" w:hanging="360"/>
+      </w:pPr>
+      <w:rPr>
+        <w:rFonts w:ascii="Wingdings" w:hAnsi="Wingdings" w:hint="default"/>
+      </w:rPr>
+    </w:lvl>
+  </w:abstractNum>
   <w:num w:numId="1" w16cid:durableId="112557429">
+    <w:abstractNumId w:val="1"/>
+  </w:num>
+  <w:num w:numId="2" w16cid:durableId="1310860477">
     <w:abstractNumId w:val="0"/>
   </w:num>
 </w:numbering>

</xml_diff>